<commit_message>
Auto commit (2026-10-07 16:53) — 3 changes
Claude Code 세션 종료 시 자동 커밋.

Co-Authored-By: Claude <noreply@anthropic.com>
Claude-Session: https://claude.ai/code/5591c702-1858-4360-9925-22aed83d50e2
</commit_message>
<xml_diff>
--- a/projects/38_revenge_puck/My Ex's Rival Is My Christmas Boyfriend_회차 트리트먼트_1-50화.docx
+++ b/projects/38_revenge_puck/My Ex's Rival Is My Christmas Boyfriend_회차 트리트먼트_1-50화.docx
@@ -462,7 +462,7 @@
           <w:b w:val="0"/>
           <w:sz w:val="20"/>
         </w:rPr>
-        <w:t>타일러 목소리가 들리자 몰리는 침대 위에서 체이스 이름을 부르며 숨넘어가는 소리를 내고, 체이스는 거기라고, 멈추지 말라고, 이제 마무리하라고 맞춰 준다. 몰리가 마지막으로 체이스를 크게 부르자 문밖에 몰려든 파티 손님들이 쟤 방금 느낀 거냐고 수군대고, 굳어 선 타일러 옆에서 누군가 들어간다며 손잡이를 잡는다. 체이스가 빨리 옷을 벗으라고 하고, 싫다고 버티던 몰리는 안 벗으면 다 들킨다는 말에 분홍 하트 무늬 속옷만 남기고 옷을 벗는다.</w:t>
+        <w:t>타일러 목소리가 들리자 몰리는 침대 위에서 체이스 이름을 부르며 숨넘어가는 소리를 내고, 체이스가 거기라고 맞춰 주자 몰리가 멈추지 말라고, 계속하라고 외치고, 체이스가 이제 마무리하라고 한다. 몰리가 마지막으로 체이스를 크게 부르자 문밖에 몰려든 파티 손님들이 쟤 방금 느낀 거냐고 수군대고, 굳어 선 타일러 옆에서 누군가 들어간다며 손잡이를 잡는다. 체이스가 빨리 옷을 벗으라고 하고, 싫다고 버티던 몰리는 안 벗으면 다 들킨다는 말에 분홍 하트 무늬 속옷만 남기고 옷을 벗는다.</w:t>
       </w:r>
     </w:p>
     <w:p>
@@ -650,7 +650,7 @@
           <w:b w:val="0"/>
           <w:sz w:val="20"/>
         </w:rPr>
-        <w:t>결국 쫓겨난 몰리가 흰 캐리어를 옆에 두고 기숙사 앞에서 갈 곳도 없는데 어떡하냐고 중얼거리는데, 돌아가다 말고 소란을 듣고 올라갔던 체이스가 브리트니가 내던진 몰리의 분홍 속옷과 옷 뭉치를 양팔에 안고 계단을 내려온다. 체이스는 분홍 브래지어를 손가락에 걸어 흔들며 나랑 그렇게 있고 싶었으면 그냥 말하지 옷으로 쇼까지 하냐고 놀리다가, 캐리어에 걸터앉은 몰리가 룸메이트 브리트니가 방금 자기를 쫓아냈다고 하자 표정이 굳는다. 「그럼 갈 데는 있고? 우리 집으로 와.」 몰리가 안 된다고 하자 체이스는 방이 두 개라 따로 쓰면 된다고 하고, 몰리가 그건 진짜 아닌 것 같다고 고개를 젓자 옷 뭉치를 어깨에 걸치며 말한다. 「우리 가짜잖아. 그러니까 아무도 이상하게 안 봐.」</w:t>
+        <w:t>결국 쫓겨난 몰리가 흰 캐리어를 옆에 두고 기숙사 계단 아래 복도에서 갈 곳도 없는데 어떡하냐고 중얼거리는데, 돌아가다 말고 소란을 듣고 올라갔던 체이스가 브리트니가 내던진 몰리의 분홍 속옷과 옷 뭉치를 양팔에 안고 계단을 내려온다. 체이스는 분홍 브래지어를 손가락에 걸어 흔들며 나랑 그렇게 있고 싶었으면 그냥 말하지 옷으로 쇼까지 하냐고 놀리다가, 캐리어에 걸터앉은 몰리가 룸메이트 브리트니가 방금 자기를 쫓아냈다고 하자 표정이 굳는다. 「그럼 갈 데는 있고? 우리 집으로 와.」 몰리가 안 된다고 하자 체이스는 방이 두 개라 따로 쓰면 된다고 하고, 몰리가 그건 진짜 아닌 것 같다고 고개를 젓자 옷 뭉치를 어깨에 걸치며 말한다. 「우리 가짜잖아. 그러니까 아무도 이상하게 안 봐.」</w:t>
       </w:r>
     </w:p>
     <w:p>
@@ -1496,7 +1496,7 @@
           <w:b w:val="0"/>
           <w:sz w:val="20"/>
         </w:rPr>
-        <w:t>몰리가 무슨 소리냐고, 갈라 내내 어디 있었냐고 따라붙어 아파트로 돌아오자, 소파에 위스키 잔을 들고 앉은 체이스는 몰리가 타일러랑 아주 붙어 있는 걸 다 봤다고, 같이 복수하는 줄 알았는데 그냥 타일러한테 돌아가고 싶었던 거라고 한다. 몰리가 타일러가 질투하는 걸 보니 통쾌했던 건 맞다고 인정하다 말이 끊기자, 체이스는 몰리가 자기를 갖고 논 거라며 계속 게임을 하고 싶으면 이번엔 자기 방식대로 하자고 잔을 내밀고, 몰리가 안 마신다고 고개를 돌리자 낮게 말한다. 「난 방금 내가 사랑하는 여자가 딴 남자랑 키스하는 걸 봤어. 그러니까 그냥 마셔 줘. 제발.」 몰리는 그 말을 술 마시라는 핑계로만 듣고 목이 타는 위스키를 넘긴 뒤, 진실 게임에서 타일러랑 다시 만날 거냐는 물음에 아니라고, 끝까지 들었으면 알았을 거라고, 키스는 했어도 역겨웠고 타일러를 좋아하지 않는다고 답한다.</w:t>
+        <w:t>몰리가 무슨 소리냐고, 갈라 내내 어디 있었냐고 따라붙어 아파트로 돌아오자, 소파에 위스키 잔을 들고 앉은 체이스는 몰리가 타일러랑 아주 붙어 있는 걸 다 봤다고, 같이 복수하는 줄 알았는데 그냥 타일러한테 돌아가고 싶었던 거라고 한다. 몰리가 타일러가 질투하는 걸 보니 통쾌했던 건 맞다고 인정하다 말이 끊기자, 체이스는 몰리가 자기를 갖고 논 거라며 계속 게임을 하고 싶으면 이번엔 자기 방식대로 하자고 잔을 내밀고, 몰리가 안 마신다고 고개를 돌리자 낮게 말한다. 「난 방금 내가 사랑하는 여자가 딴 남자랑 키스하는 걸 봤어. 그러니까 그냥 마셔 줘. 제발.」 몰리는 그 말을 술 마시라는 핑계로만 듣고 목이 타는 위스키를 넘긴 뒤, 진실 게임에서 타일러랑 다시 만날 거냐는 물음에 아니라고 하고, 내가 방금 봤는데 거짓말하냐고 몰아붙이는 체이스에게 끝까지 들었으면 알았을 거라고, 키스는 했어도 역겨웠고 타일러를 좋아하지 않는다고 답한다.</w:t>
       </w:r>
     </w:p>
     <w:p>
@@ -1517,7 +1517,7 @@
           <w:b w:val="0"/>
           <w:sz w:val="20"/>
         </w:rPr>
-        <w:t xml:space="preserve"> 내가 방금 봤는데 거짓말하냐고 체이스가 몰아붙이자, 몰리가 체이스 눈을 똑바로 본다. 「나 다른 사람 좋아해.」</w:t>
+        <w:t xml:space="preserve"> 몰리가 체이스 눈을 똑바로 본다. 「나 다른 사람 좋아해.」</w:t>
       </w:r>
     </w:p>
     <w:p>

</xml_diff>